<commit_message>
Update COMP 9500 paper and progress with qualified student comparison
</commit_message>
<xml_diff>
--- a/deliverables/2026-10-19/COMP9500-Progress-2026-10-19.docx
+++ b/deliverables/2026-10-19/COMP9500-Progress-2026-10-19.docx
@@ -191,6 +191,24 @@
     <w:p>
       <w:r>
         <w:t>The public repository contains compact evidence and the full raw study archive remains separate. The saved Experiment 1 integrity receipt matched 288/288 files. Full Windows and Colab replay and an older score-hash difference remain unresolved.</w:t>
+      </w:r>
+    </w:p>
+    <w:p>
+      <w:pPr>
+        <w:pStyle w:val="Heading1"/>
+      </w:pPr>
+      <w:r>
+        <w:t>Annotation status as of 20 October 2026</w:t>
+      </w:r>
+    </w:p>
+    <w:p>
+      <w:r>
+        <w:t>Vibhor Singh Malik submitted answers for all 100 questions in the original v2 student worksheet and reports entering them manually without seeing reference answers. The submitted CSV has 100 unique expected IDs and 125 parseable directives. Its original bytes are retained. After submission, he approved using the rubric's written strength convention for 99 unqualified boosts or reductions and eight exclusions; 18 explicitly graded strengths were kept. A separately versioned encoded copy passes command-schema validation for all 100 questions. This is a later encoding decision, not a value entered in the original CSV.</w:t>
+      </w:r>
+    </w:p>
+    <w:p>
+      <w:r>
+        <w:t>The original v2 bank was subsequently recovered with a matching commitment. A separate descriptive comparison found 99/100 exact commands between the student's rubric-encoded responses and the AI-authored initial corpus labels (Cohen's kappa 0.9899). The only difference is one strength field; neither original label was edited. These are not two human annotators. Exact student annotation times and the required original-route receipt were not recorded, and no blind adjudication or human-reference parser run has occurred. The 14 October model-reference results above are unchanged. Historical development-summary exposure reports also need an explicit eligibility account.</w:t>
       </w:r>
     </w:p>
     <w:sectPr>

</xml_diff>

<commit_message>
Edit COMP 9500 review materials for clarity
</commit_message>
<xml_diff>
--- a/deliverables/2026-10-19/COMP9500-Progress-2026-10-19.docx
+++ b/deliverables/2026-10-19/COMP9500-Progress-2026-10-19.docx
@@ -4,217 +4,91 @@
   <w:body>
     <w:p>
       <w:pPr>
-        <w:pStyle w:val="Title"/>
+        <w:pStyle w:val="Heading1"/>
       </w:pPr>
       <w:r>
-        <w:t>Research Progress</w:t>
+        <w:t>COMP 9500 Research Progress</w:t>
       </w:r>
     </w:p>
     <w:p>
       <w:pPr>
-        <w:spacing w:after="240"/>
+        <w:spacing w:after="220"/>
+        <w:jc w:val="left"/>
       </w:pPr>
       <w:r>
-        <w:t>Vibhor Malik  |  COMP 9500  |  19 October 2026</w:t>
+        <w:rPr>
+          <w:color w:val="636F7A"/>
+          <w:sz w:val="18"/>
+        </w:rPr>
+        <w:t>Vibhor Malik  |  20 October 2026</w:t>
       </w:r>
     </w:p>
     <w:p>
       <w:pPr>
-        <w:pStyle w:val="Heading1"/>
+        <w:pStyle w:val="Heading2"/>
       </w:pPr>
       <w:r>
-        <w:t>Completed evaluation</w:t>
+        <w:t>Overview</w:t>
       </w:r>
     </w:p>
     <w:p>
       <w:r>
-        <w:t>The 14 October evaluation tested 100 fresh synthetic requests against model-generated reference commands. Llama matched 76 commands, with 23 validation rejections and one accepted mismatch; the rule parser matched 11. Two separately contextualized model annotation passes agreed on all 100 initial commands. Their agreement is not human validation.</w:t>
+        <w:t>I have completed the current offline evaluation of natural-language controls for a short-video recommender and updated the paper and slides for review. The controls changed which categories appeared in the feed, but the historical next-item ranking measure was lower under stronger control. I have also read the cited papers and checked the background claims used in the draft.</w:t>
       </w:r>
     </w:p>
-    <w:tbl>
-      <w:tblPr>
-        <w:tblStyle w:val="LightShading-Accent1"/>
-        <w:tblW w:type="auto" w:w="0"/>
-        <w:jc w:val="center"/>
-        <w:tblLook w:firstColumn="1" w:firstRow="1" w:lastColumn="0" w:lastRow="0" w:noHBand="0" w:noVBand="1" w:val="04A0"/>
-      </w:tblPr>
-      <w:tblGrid>
-        <w:gridCol w:w="5112"/>
-        <w:gridCol w:w="5112"/>
-      </w:tblGrid>
-      <w:tr>
-        <w:tc>
-          <w:tcPr>
-            <w:tcW w:type="dxa" w:w="5112"/>
-          </w:tcPr>
-          <w:p>
-            <w:r>
-              <w:t>Result</w:t>
-            </w:r>
-          </w:p>
-        </w:tc>
-        <w:tc>
-          <w:tcPr>
-            <w:tcW w:type="dxa" w:w="5112"/>
-          </w:tcPr>
-          <w:p>
-            <w:r>
-              <w:t>Saved finding</w:t>
-            </w:r>
-          </w:p>
-        </w:tc>
-      </w:tr>
-      <w:tr>
-        <w:tc>
-          <w:tcPr>
-            <w:tcW w:type="dxa" w:w="5112"/>
-          </w:tcPr>
-          <w:p>
-            <w:r>
-              <w:t>Experiment 1</w:t>
-            </w:r>
-          </w:p>
-        </w:tc>
-        <w:tc>
-          <w:tcPr>
-            <w:tcW w:type="dxa" w:w="5112"/>
-          </w:tcPr>
-          <w:p>
-            <w:r>
-              <w:t>Target exposure: 11.6% to 79.2%; muted exposure: 6.1% to zero. Boost NDCG@10: 0.03012 to 0.01637.</w:t>
-            </w:r>
-          </w:p>
-        </w:tc>
-      </w:tr>
-      <w:tr>
-        <w:tc>
-          <w:tcPr>
-            <w:tcW w:type="dxa" w:w="5112"/>
-          </w:tcPr>
-          <w:p>
-            <w:r>
-              <w:t>Exposed practice</w:t>
-            </w:r>
-          </w:p>
-        </w:tc>
-        <w:tc>
-          <w:tcPr>
-            <w:tcW w:type="dxa" w:w="5112"/>
-          </w:tcPr>
-          <w:p>
-            <w:r>
-              <w:t>73/100 validated Llama commands on a previously exposed bank; separate from the fresh evaluation.</w:t>
-            </w:r>
-          </w:p>
-        </w:tc>
-      </w:tr>
-      <w:tr>
-        <w:tc>
-          <w:tcPr>
-            <w:tcW w:type="dxa" w:w="5112"/>
-          </w:tcPr>
-          <w:p>
-            <w:r>
-              <w:t>Fresh control</w:t>
-            </w:r>
-          </w:p>
-        </w:tc>
-        <w:tc>
-          <w:tcPr>
-            <w:tcW w:type="dxa" w:w="5112"/>
-          </w:tcPr>
-          <w:p>
-            <w:r>
-              <w:t>Mean user success: 20.145% Llama, 3.854% rules, 3.815% item feedback. Conditional requests: zero successes.</w:t>
-            </w:r>
-          </w:p>
-        </w:tc>
-      </w:tr>
-      <w:tr>
-        <w:tc>
-          <w:tcPr>
-            <w:tcW w:type="dxa" w:w="5112"/>
-          </w:tcPr>
-          <w:p>
-            <w:r>
-              <w:t>Ranking quality</w:t>
-            </w:r>
-          </w:p>
-        </w:tc>
-        <w:tc>
-          <w:tcPr>
-            <w:tcW w:type="dxa" w:w="5112"/>
-          </w:tcPr>
-          <w:p>
-            <w:r>
-              <w:t>NDCG@10: 0.02580 Llama versus 0.03184 item feedback on a historical next-item proxy.</w:t>
-            </w:r>
-          </w:p>
-        </w:tc>
-      </w:tr>
-      <w:tr>
-        <w:tc>
-          <w:tcPr>
-            <w:tcW w:type="dxa" w:w="5112"/>
-          </w:tcPr>
-          <w:p>
-            <w:r>
-              <w:t>Evidence</w:t>
-            </w:r>
-          </w:p>
-        </w:tc>
-        <w:tc>
-          <w:tcPr>
-            <w:tcW w:type="dxa" w:w="5112"/>
-          </w:tcPr>
-          <w:p>
-            <w:r>
-              <w:t>865 ranking users, three seeds, 41,520 ranking rows and 2,595 score vectors; 1,666,140 audit checks found no discrepancies.</w:t>
-            </w:r>
-          </w:p>
-        </w:tc>
-      </w:tr>
-    </w:tbl>
     <w:p>
       <w:pPr>
-        <w:pStyle w:val="Heading1"/>
+        <w:pStyle w:val="Heading2"/>
       </w:pPr>
       <w:r>
-        <w:t>Interpretation and limits</w:t>
+        <w:t>Results</w:t>
       </w:r>
     </w:p>
     <w:p>
       <w:r>
-        <w:t>Control success required a complete ten-item ranking, the requested category counts, and position-weighted exposure movement in the requested direction. The result supports stronger pooled category control in this fixed synthetic setting, while the conditional failure and lower next-item NDCG@10 constrain the claim. The same 100 request texts were reused across users. No human preference or satisfaction was measured.</w:t>
+        <w:t>In Experiment 1, the target category's share rose from 11.6% to 79.2% when boosted, while exposure to a muted category fell from 6.1% to zero. Boosting also reduced NDCG@10 from 0.03012 to 0.01637, so the added control did not improve the historical ranking measure.</w:t>
       </w:r>
     </w:p>
     <w:p>
       <w:r>
-        <w:t>The public repository contains compact evidence and the full raw study archive remains separate. The saved Experiment 1 integrity receipt matched 288/288 files. Full Windows and Colab replay and an older score-hash difference remain unresolved.</w:t>
+        <w:t>The separate October 14 evaluation used 100 fresh synthetic requests and model-generated reference instructions. Llama matched 76 complete instructions, compared with 11 for a rule parser. Twenty-three Llama outputs failed validation, and one other accepted output differed from its reference. Mean category-control success was 20.145% with Llama versus 3.815% with one-item feedback. Conditional requests had no successful controls, and next-item NDCG@10 was lower with Llama (0.02580 versus 0.03184).</w:t>
+      </w:r>
+    </w:p>
+    <w:p>
+      <w:r>
+        <w:t>These are results from an offline synthetic test. The references were generated by a model, and the study did not measure real users' preferences or satisfaction.</w:t>
       </w:r>
     </w:p>
     <w:p>
       <w:pPr>
-        <w:pStyle w:val="Heading1"/>
+        <w:pStyle w:val="Heading2"/>
       </w:pPr>
       <w:r>
-        <w:t>Annotation status as of 20 October 2026</w:t>
+        <w:t>Student response check</w:t>
       </w:r>
     </w:p>
     <w:p>
       <w:r>
-        <w:t>Vibhor Singh Malik submitted answers for all 100 questions in the original v2 student worksheet and reports entering them manually without seeing reference answers. The submitted CSV has 100 unique expected IDs and 125 parseable directives. Its original bytes are retained. After submission, he approved using the rubric's written strength convention for 99 unqualified boosts or reductions and eight exclusions; 18 explicitly graded strengths were kept. A separately versioned encoded copy passes command-schema validation for all 100 questions. This is a later encoding decision, not a value entered in the original CSV.</w:t>
+        <w:t>I also submitted my own responses to the 100 original worksheet questions. After I confirmed how the study's existing annotation rules apply when a request does not state a strength, my responses matched 99 of the 100 initial model-written labels. This is a useful consistency check, but it is not agreement between two human annotators or a final human-validated evaluation.</w:t>
+      </w:r>
+    </w:p>
+    <w:p>
+      <w:pPr>
+        <w:pStyle w:val="Heading2"/>
+      </w:pPr>
+      <w:r>
+        <w:t>Next steps</w:t>
       </w:r>
     </w:p>
     <w:p>
       <w:r>
-        <w:t>The original v2 bank was subsequently recovered with a matching commitment. A separate descriptive comparison found 99/100 exact commands between the student's rubric-encoded responses and the AI-authored initial corpus labels (Cohen's kappa 0.9899). The only difference is one strength field; neither original label was edited. These are not two human annotators. Exact student annotation times and the required original-route receipt were not recorded, and no blind adjudication or human-reference parser run has occurred. The 14 October model-reference results above are unchanged. Historical development-summary exposure reports also need an explicit eligibility account.</w:t>
+        <w:t>For the separate human-labeled version of the study, I still need to complete the annotation record, settle how earlier development-result summaries affect the independence of the comparison, and review the one difference without consulting model outputs. I will bring these points to the October 23 readiness review. I would welcome feedback on the paper and on whether the completed model-reference evaluation meets the expected COMP 9500 scope.</w:t>
       </w:r>
     </w:p>
     <w:sectPr>
       <w:footerReference w:type="default" r:id="rId9"/>
       <w:pgSz w:w="12240" w:h="15840"/>
-      <w:pgMar w:top="936" w:right="1008" w:bottom="893" w:left="1008" w:header="720" w:footer="720" w:gutter="0"/>
+      <w:pgMar w:top="1080" w:right="1224" w:bottom="1037" w:left="1224" w:header="720" w:footer="720" w:gutter="0"/>
       <w:cols w:space="720"/>
       <w:docGrid w:linePitch="360"/>
     </w:sectPr>
@@ -231,9 +105,11 @@
     </w:pPr>
     <w:r>
       <w:rPr>
+        <w:rFonts w:ascii="Aptos" w:hAnsi="Aptos"/>
+        <w:color w:val="7F8A93"/>
         <w:sz w:val="16"/>
       </w:rPr>
-      <w:t>COMP 9500  |  19 October 2026</w:t>
+      <w:t>COMP 9500  |  20 October 2026</w:t>
     </w:r>
   </w:p>
 </w:ftr>
@@ -603,11 +479,12 @@
     <w:qFormat/>
     <w:rsid w:val="00FC693F"/>
     <w:pPr>
-      <w:spacing w:after="100"/>
+      <w:spacing w:after="120" w:line="276" w:lineRule="auto"/>
     </w:pPr>
     <w:rPr>
-      <w:rFonts w:ascii="Arial" w:hAnsi="Arial"/>
-      <w:sz w:val="18"/>
+      <w:rFonts w:ascii="Aptos" w:hAnsi="Aptos"/>
+      <w:color w:val="27303A"/>
+      <w:sz w:val="20"/>
     </w:rPr>
   </w:style>
   <w:style w:type="paragraph" w:styleId="Header">
@@ -665,15 +542,15 @@
     <w:pPr>
       <w:keepNext/>
       <w:keepLines/>
-      <w:spacing w:before="480" w:after="100"/>
+      <w:spacing w:before="480" w:after="60"/>
       <w:outlineLvl w:val="0"/>
     </w:pPr>
     <w:rPr>
-      <w:rFonts w:asciiTheme="majorHAnsi" w:eastAsiaTheme="majorEastAsia" w:hAnsiTheme="majorHAnsi" w:cstheme="majorBidi" w:ascii="Arial" w:hAnsi="Arial"/>
+      <w:rFonts w:asciiTheme="majorHAnsi" w:eastAsiaTheme="majorEastAsia" w:hAnsiTheme="majorHAnsi" w:cstheme="majorBidi" w:ascii="Aptos Display" w:hAnsi="Aptos Display"/>
       <w:b/>
       <w:bCs/>
-      <w:color w:val="003C71"/>
-      <w:sz w:val="22"/>
+      <w:color w:val="183B56"/>
+      <w:sz w:val="32"/>
       <w:szCs w:val="28"/>
     </w:rPr>
   </w:style>
@@ -689,15 +566,15 @@
     <w:pPr>
       <w:keepNext/>
       <w:keepLines/>
-      <w:spacing w:before="200" w:after="0"/>
+      <w:spacing w:before="180" w:after="60"/>
       <w:outlineLvl w:val="1"/>
     </w:pPr>
     <w:rPr>
-      <w:rFonts w:asciiTheme="majorHAnsi" w:eastAsiaTheme="majorEastAsia" w:hAnsiTheme="majorHAnsi" w:cstheme="majorBidi"/>
+      <w:rFonts w:asciiTheme="majorHAnsi" w:eastAsiaTheme="majorEastAsia" w:hAnsiTheme="majorHAnsi" w:cstheme="majorBidi" w:ascii="Aptos Display" w:hAnsi="Aptos Display"/>
       <w:b/>
       <w:bCs/>
-      <w:color w:val="4F81BD" w:themeColor="accent1"/>
-      <w:sz w:val="26"/>
+      <w:color w:val="183B56"/>
+      <w:sz w:val="21"/>
       <w:szCs w:val="26"/>
     </w:rPr>
   </w:style>
@@ -954,16 +831,15 @@
       <w:pBdr>
         <w:bottom w:val="single" w:sz="8" w:space="4" w:color="4F81BD" w:themeColor="accent1"/>
       </w:pBdr>
-      <w:spacing w:after="100" w:line="240" w:lineRule="auto"/>
+      <w:spacing w:after="300" w:line="240" w:lineRule="auto"/>
       <w:contextualSpacing/>
     </w:pPr>
     <w:rPr>
-      <w:rFonts w:asciiTheme="majorHAnsi" w:eastAsiaTheme="majorEastAsia" w:hAnsiTheme="majorHAnsi" w:cstheme="majorBidi" w:ascii="Arial" w:hAnsi="Arial"/>
-      <w:b/>
-      <w:color w:val="003C71"/>
+      <w:rFonts w:asciiTheme="majorHAnsi" w:eastAsiaTheme="majorEastAsia" w:hAnsiTheme="majorHAnsi" w:cstheme="majorBidi"/>
+      <w:color w:val="17365D" w:themeColor="text2" w:themeShade="BF"/>
       <w:spacing w:val="5"/>
       <w:kern w:val="28"/>
-      <w:sz w:val="32"/>
+      <w:sz w:val="52"/>
       <w:szCs w:val="52"/>
     </w:rPr>
   </w:style>

</xml_diff>

<commit_message>
Clarify completed annotations in progress materials
</commit_message>
<xml_diff>
--- a/deliverables/2026-10-19/COMP9500-Progress-2026-10-19.docx
+++ b/deliverables/2026-10-19/COMP9500-Progress-2026-10-19.docx
@@ -20,7 +20,7 @@
           <w:color w:val="636F7A"/>
           <w:sz w:val="18"/>
         </w:rPr>
-        <w:t>Vibhor Malik  |  20 October 2026</w:t>
+        <w:t>Vibhor Malik  |  Consolidated update through 20 October 2026</w:t>
       </w:r>
     </w:p>
     <w:p>
@@ -33,7 +33,7 @@
     </w:p>
     <w:p>
       <w:r>
-        <w:t>I have completed the current offline evaluation of natural-language controls for a short-video recommender and updated the paper and slides for review. The controls changed which categories appeared in the feed, but the historical next-item ranking measure was lower under stronger control. I have also read the cited papers and checked the background claims used in the draft.</w:t>
+        <w:t>This note brings together progress for the missed October 11 and 18 updates. I have completed the current offline evaluation of natural-language controls for a short-video recommender and updated my working paper and slides with the results. The controls changed which categories appeared in the feed, but the historical next-item ranking measure was lower under stronger control. I have also read the cited papers and checked the background claims used in the draft.</w:t>
       </w:r>
     </w:p>
     <w:p>
@@ -69,7 +69,7 @@
     </w:p>
     <w:p>
       <w:r>
-        <w:t>I also submitted my own responses to the 100 original worksheet questions. After I confirmed how the study's existing annotation rules apply when a request does not state a strength, my responses matched 99 of the 100 initial model-written labels. This is a useful consistency check, but it is not agreement between two human annotators or a final human-validated evaluation.</w:t>
+        <w:t>I completed and submitted my responses to all 100 original worksheet questions. After I confirmed how the study's existing annotation rules apply when a request does not state a strength, my responses matched 99 of the 100 initial model-written labels. This is a useful consistency check, but it is not agreement between two human annotators or a final human-validated evaluation.</w:t>
       </w:r>
     </w:p>
     <w:p>
@@ -82,7 +82,7 @@
     </w:p>
     <w:p>
       <w:r>
-        <w:t>For the separate human-labeled version of the study, I still need to complete the annotation record, settle how earlier development-result summaries affect the independence of the comparison, and review the one difference without consulting model outputs. I will bring these points to the October 23 readiness review. I would welcome feedback on the paper and on whether the completed model-reference evaluation meets the expected COMP 9500 scope.</w:t>
+        <w:t>My 100-question worksheet is complete and preserved. The 99/100 comparison is available, but the worksheet has not yet been adjudicated into a human reference for the planned parser and ranking evaluation. This week I will review the one difference, check the runtime and document the October 23 go or no-go decision under my original 135-hour plan. I would welcome feedback on my progress against that plan.</w:t>
       </w:r>
     </w:p>
     <w:sectPr>

</xml_diff>

<commit_message>
Use student-revised COMP 9500 progress note
</commit_message>
<xml_diff>
--- a/deliverables/2026-10-19/COMP9500-Progress-2026-10-19.docx
+++ b/deliverables/2026-10-19/COMP9500-Progress-2026-10-19.docx
@@ -4,7 +4,7 @@
   <w:body>
     <w:p>
       <w:pPr>
-        <w:pStyle w:val="Heading1"/>
+        <w:pStyle w:val="Title"/>
       </w:pPr>
       <w:r>
         <w:t>COMP 9500 Research Progress</w:t>
@@ -12,15 +12,11 @@
     </w:p>
     <w:p>
       <w:pPr>
-        <w:spacing w:after="220"/>
-        <w:jc w:val="left"/>
+        <w:pStyle w:val="Subtitle"/>
+        <w:spacing w:after="240"/>
       </w:pPr>
       <w:r>
-        <w:rPr>
-          <w:color w:val="636F7A"/>
-          <w:sz w:val="18"/>
-        </w:rPr>
-        <w:t>Vibhor Malik  |  Consolidated update through 20 October 2026</w:t>
+        <w:t>Vibhor Malik | Consolidated update through 20 October 2026</w:t>
       </w:r>
     </w:p>
     <w:p>
@@ -33,7 +29,7 @@
     </w:p>
     <w:p>
       <w:r>
-        <w:t>This note brings together progress for the missed October 11 and 18 updates. I have completed the current offline evaluation of natural-language controls for a short-video recommender and updated my working paper and slides with the results. The controls changed which categories appeared in the feed, but the historical next-item ranking measure was lower under stronger control. I have also read the cited papers and checked the background claims used in the draft.</w:t>
+        <w:t>This note brings together progress for the missed October 11 and 18 updates. I have completed the current offline evaluation of natural-language controls for a short-video recommender and updated my working paper and slides with the results. The controls changed which categories appeared in the feed, but the historical next-item ranking measure was lower under stronger control.</w:t>
       </w:r>
     </w:p>
     <w:p>
@@ -69,7 +65,7 @@
     </w:p>
     <w:p>
       <w:r>
-        <w:t>I completed and submitted my responses to all 100 original worksheet questions. After I confirmed how the study's existing annotation rules apply when a request does not state a strength, my responses matched 99 of the 100 initial model-written labels. This is a useful consistency check, but it is not agreement between two human annotators or a final human-validated evaluation.</w:t>
+        <w:t>I completed and submitted my responses to all 100 original worksheet questions. My responses matched 99 of the 100 initial model-written labels.</w:t>
       </w:r>
     </w:p>
     <w:p>
@@ -82,13 +78,13 @@
     </w:p>
     <w:p>
       <w:r>
-        <w:t>My 100-question worksheet is complete and preserved. The 99/100 comparison is available, but the worksheet has not yet been adjudicated into a human reference for the planned parser and ranking evaluation. This week I will review the one difference, check the runtime and document the October 23 go or no-go decision under my original 135-hour plan. I would welcome feedback on my progress against that plan.</w:t>
+        <w:t>My 100-question worksheet is complete and preserved. The 99/100 comparison is available, but the worksheet has not yet been adjudicated into a human reference for the planned parser and ranking evaluation. This week I will review the one difference, check the runtime and document the decision under my original 135-hour plan.</w:t>
       </w:r>
     </w:p>
     <w:sectPr>
       <w:footerReference w:type="default" r:id="rId9"/>
       <w:pgSz w:w="12240" w:h="15840"/>
-      <w:pgMar w:top="1080" w:right="1224" w:bottom="1037" w:left="1224" w:header="720" w:footer="720" w:gutter="0"/>
+      <w:pgMar w:top="979" w:right="1152" w:bottom="893" w:left="1152" w:header="720" w:footer="720" w:gutter="0"/>
       <w:cols w:space="720"/>
       <w:docGrid w:linePitch="360"/>
     </w:sectPr>
@@ -106,10 +102,10 @@
     <w:r>
       <w:rPr>
         <w:rFonts w:ascii="Aptos" w:hAnsi="Aptos"/>
-        <w:color w:val="7F8A93"/>
+        <w:color w:val="6E7882"/>
         <w:sz w:val="16"/>
       </w:rPr>
-      <w:t>COMP 9500  |  20 October 2026</w:t>
+      <w:t>COMP 9500 | 20 October 2026</w:t>
     </w:r>
   </w:p>
 </w:ftr>
@@ -479,11 +475,11 @@
     <w:qFormat/>
     <w:rsid w:val="00FC693F"/>
     <w:pPr>
-      <w:spacing w:after="120" w:line="276" w:lineRule="auto"/>
+      <w:spacing w:after="140" w:line="269" w:lineRule="auto"/>
     </w:pPr>
     <w:rPr>
       <w:rFonts w:ascii="Aptos" w:hAnsi="Aptos"/>
-      <w:color w:val="27303A"/>
+      <w:color w:val="232E37"/>
       <w:sz w:val="20"/>
     </w:rPr>
   </w:style>
@@ -542,15 +538,15 @@
     <w:pPr>
       <w:keepNext/>
       <w:keepLines/>
-      <w:spacing w:before="480" w:after="60"/>
+      <w:spacing w:before="480" w:after="0"/>
       <w:outlineLvl w:val="0"/>
     </w:pPr>
     <w:rPr>
-      <w:rFonts w:asciiTheme="majorHAnsi" w:eastAsiaTheme="majorEastAsia" w:hAnsiTheme="majorHAnsi" w:cstheme="majorBidi" w:ascii="Aptos Display" w:hAnsi="Aptos Display"/>
+      <w:rFonts w:asciiTheme="majorHAnsi" w:eastAsiaTheme="majorEastAsia" w:hAnsiTheme="majorHAnsi" w:cstheme="majorBidi"/>
       <w:b/>
       <w:bCs/>
-      <w:color w:val="183B56"/>
-      <w:sz w:val="32"/>
+      <w:color w:val="365F91" w:themeColor="accent1" w:themeShade="BF"/>
+      <w:sz w:val="28"/>
       <w:szCs w:val="28"/>
     </w:rPr>
   </w:style>
@@ -566,15 +562,15 @@
     <w:pPr>
       <w:keepNext/>
       <w:keepLines/>
-      <w:spacing w:before="180" w:after="60"/>
+      <w:spacing w:before="220" w:after="100"/>
       <w:outlineLvl w:val="1"/>
     </w:pPr>
     <w:rPr>
       <w:rFonts w:asciiTheme="majorHAnsi" w:eastAsiaTheme="majorEastAsia" w:hAnsiTheme="majorHAnsi" w:cstheme="majorBidi" w:ascii="Aptos Display" w:hAnsi="Aptos Display"/>
       <w:b/>
       <w:bCs/>
-      <w:color w:val="183B56"/>
-      <w:sz w:val="21"/>
+      <w:color w:val="1B374B"/>
+      <w:sz w:val="23"/>
       <w:szCs w:val="26"/>
     </w:rPr>
   </w:style>
@@ -831,15 +827,16 @@
       <w:pBdr>
         <w:bottom w:val="single" w:sz="8" w:space="4" w:color="4F81BD" w:themeColor="accent1"/>
       </w:pBdr>
-      <w:spacing w:after="300" w:line="240" w:lineRule="auto"/>
+      <w:spacing w:after="100" w:line="240" w:lineRule="auto" w:before="0"/>
       <w:contextualSpacing/>
     </w:pPr>
     <w:rPr>
-      <w:rFonts w:asciiTheme="majorHAnsi" w:eastAsiaTheme="majorEastAsia" w:hAnsiTheme="majorHAnsi" w:cstheme="majorBidi"/>
-      <w:color w:val="17365D" w:themeColor="text2" w:themeShade="BF"/>
+      <w:rFonts w:asciiTheme="majorHAnsi" w:eastAsiaTheme="majorEastAsia" w:hAnsiTheme="majorHAnsi" w:cstheme="majorBidi" w:ascii="Aptos Display" w:hAnsi="Aptos Display"/>
+      <w:b/>
+      <w:color w:val="1B374B"/>
       <w:spacing w:val="5"/>
       <w:kern w:val="28"/>
-      <w:sz w:val="52"/>
+      <w:sz w:val="36"/>
       <w:szCs w:val="52"/>
     </w:rPr>
   </w:style>
@@ -872,12 +869,12 @@
       </w:numPr>
     </w:pPr>
     <w:rPr>
-      <w:rFonts w:asciiTheme="majorHAnsi" w:eastAsiaTheme="majorEastAsia" w:hAnsiTheme="majorHAnsi" w:cstheme="majorBidi"/>
+      <w:rFonts w:asciiTheme="majorHAnsi" w:eastAsiaTheme="majorEastAsia" w:hAnsiTheme="majorHAnsi" w:cstheme="majorBidi" w:ascii="Aptos" w:hAnsi="Aptos"/>
       <w:i/>
       <w:iCs/>
-      <w:color w:val="4F81BD" w:themeColor="accent1"/>
+      <w:color w:val="586670"/>
       <w:spacing w:val="15"/>
-      <w:sz w:val="24"/>
+      <w:sz w:val="19"/>
       <w:szCs w:val="24"/>
     </w:rPr>
   </w:style>

</xml_diff>